<commit_message>
Finishing the analysis and most of the code
</commit_message>
<xml_diff>
--- a/Docs/Errors LOG.docx
+++ b/Docs/Errors LOG.docx
@@ -413,15 +413,70 @@
     <w:p/>
     <w:p>
       <w:r>
-        <w:t>Moving from outdated official soundcloud package to json one</w:t>
-      </w:r>
-    </w:p>
-    <w:p/>
+        <w:t xml:space="preserve">Moving from outdated official soundcloud </w:t>
+      </w:r>
+      <w:r>
+        <w:t xml:space="preserve">&amp; sclib </w:t>
+      </w:r>
+      <w:r>
+        <w:t>package</w:t>
+      </w:r>
+      <w:r>
+        <w:t>s</w:t>
+      </w:r>
+      <w:r>
+        <w:t xml:space="preserve"> to json one</w:t>
+      </w:r>
+    </w:p>
     <w:p>
       <w:r>
         <w:rPr>
           <w:noProof/>
         </w:rPr>
+        <w:drawing>
+          <wp:inline distT="0" distB="0" distL="0" distR="0" wp14:anchorId="1A0B7360" wp14:editId="65C4A59B">
+            <wp:extent cx="5943600" cy="2999740"/>
+            <wp:effectExtent l="0" t="0" r="0" b="0"/>
+            <wp:docPr id="2108445404" name="Picture 1"/>
+            <wp:cNvGraphicFramePr>
+              <a:graphicFrameLocks xmlns:a="http://schemas.openxmlformats.org/drawingml/2006/main" noChangeAspect="1"/>
+            </wp:cNvGraphicFramePr>
+            <a:graphic xmlns:a="http://schemas.openxmlformats.org/drawingml/2006/main">
+              <a:graphicData uri="http://schemas.openxmlformats.org/drawingml/2006/picture">
+                <pic:pic xmlns:pic="http://schemas.openxmlformats.org/drawingml/2006/picture">
+                  <pic:nvPicPr>
+                    <pic:cNvPr id="2108445404" name=""/>
+                    <pic:cNvPicPr/>
+                  </pic:nvPicPr>
+                  <pic:blipFill>
+                    <a:blip r:embed="rId8"/>
+                    <a:stretch>
+                      <a:fillRect/>
+                    </a:stretch>
+                  </pic:blipFill>
+                  <pic:spPr>
+                    <a:xfrm>
+                      <a:off x="0" y="0"/>
+                      <a:ext cx="5943600" cy="2999740"/>
+                    </a:xfrm>
+                    <a:prstGeom prst="rect">
+                      <a:avLst/>
+                    </a:prstGeom>
+                  </pic:spPr>
+                </pic:pic>
+              </a:graphicData>
+            </a:graphic>
+          </wp:inline>
+        </w:drawing>
+      </w:r>
+    </w:p>
+    <w:p/>
+    <w:p>
+      <w:r>
+        <w:rPr>
+          <w:noProof/>
+        </w:rPr>
+        <w:lastRenderedPageBreak/>
         <w:drawing>
           <wp:inline distT="0" distB="0" distL="0" distR="0" wp14:anchorId="14FCFC66" wp14:editId="0D8B372E">
             <wp:extent cx="5943600" cy="3343275"/>
@@ -438,7 +493,7 @@
                     <pic:cNvPicPr/>
                   </pic:nvPicPr>
                   <pic:blipFill>
-                    <a:blip r:embed="rId8"/>
+                    <a:blip r:embed="rId9"/>
                     <a:stretch>
                       <a:fillRect/>
                     </a:stretch>
@@ -447,6 +502,101 @@
                     <a:xfrm>
                       <a:off x="0" y="0"/>
                       <a:ext cx="5943600" cy="3343275"/>
+                    </a:xfrm>
+                    <a:prstGeom prst="rect">
+                      <a:avLst/>
+                    </a:prstGeom>
+                  </pic:spPr>
+                </pic:pic>
+              </a:graphicData>
+            </a:graphic>
+          </wp:inline>
+        </w:drawing>
+      </w:r>
+    </w:p>
+    <w:p/>
+    <w:p>
+      <w:r>
+        <w:t>Test works</w:t>
+      </w:r>
+    </w:p>
+    <w:p>
+      <w:r>
+        <w:rPr>
+          <w:noProof/>
+        </w:rPr>
+        <w:drawing>
+          <wp:inline distT="0" distB="0" distL="0" distR="0" wp14:anchorId="2EC6B018" wp14:editId="78C45AE7">
+            <wp:extent cx="5943600" cy="3426460"/>
+            <wp:effectExtent l="0" t="0" r="0" b="2540"/>
+            <wp:docPr id="94744490" name="Picture 1"/>
+            <wp:cNvGraphicFramePr>
+              <a:graphicFrameLocks xmlns:a="http://schemas.openxmlformats.org/drawingml/2006/main" noChangeAspect="1"/>
+            </wp:cNvGraphicFramePr>
+            <a:graphic xmlns:a="http://schemas.openxmlformats.org/drawingml/2006/main">
+              <a:graphicData uri="http://schemas.openxmlformats.org/drawingml/2006/picture">
+                <pic:pic xmlns:pic="http://schemas.openxmlformats.org/drawingml/2006/picture">
+                  <pic:nvPicPr>
+                    <pic:cNvPr id="94744490" name=""/>
+                    <pic:cNvPicPr/>
+                  </pic:nvPicPr>
+                  <pic:blipFill>
+                    <a:blip r:embed="rId10"/>
+                    <a:stretch>
+                      <a:fillRect/>
+                    </a:stretch>
+                  </pic:blipFill>
+                  <pic:spPr>
+                    <a:xfrm>
+                      <a:off x="0" y="0"/>
+                      <a:ext cx="5943600" cy="3426460"/>
+                    </a:xfrm>
+                    <a:prstGeom prst="rect">
+                      <a:avLst/>
+                    </a:prstGeom>
+                  </pic:spPr>
+                </pic:pic>
+              </a:graphicData>
+            </a:graphic>
+          </wp:inline>
+        </w:drawing>
+      </w:r>
+    </w:p>
+    <w:p/>
+    <w:p/>
+    <w:p/>
+    <w:p>
+      <w:r>
+        <w:t>Using iso format to make it easier to reverse</w:t>
+      </w:r>
+    </w:p>
+    <w:p>
+      <w:r>
+        <w:drawing>
+          <wp:inline distT="0" distB="0" distL="0" distR="0" wp14:anchorId="7FA1C44E" wp14:editId="0DF44E8E">
+            <wp:extent cx="5943600" cy="2421890"/>
+            <wp:effectExtent l="0" t="0" r="0" b="0"/>
+            <wp:docPr id="1047120474" name="Picture 1"/>
+            <wp:cNvGraphicFramePr>
+              <a:graphicFrameLocks xmlns:a="http://schemas.openxmlformats.org/drawingml/2006/main" noChangeAspect="1"/>
+            </wp:cNvGraphicFramePr>
+            <a:graphic xmlns:a="http://schemas.openxmlformats.org/drawingml/2006/main">
+              <a:graphicData uri="http://schemas.openxmlformats.org/drawingml/2006/picture">
+                <pic:pic xmlns:pic="http://schemas.openxmlformats.org/drawingml/2006/picture">
+                  <pic:nvPicPr>
+                    <pic:cNvPr id="1047120474" name=""/>
+                    <pic:cNvPicPr/>
+                  </pic:nvPicPr>
+                  <pic:blipFill>
+                    <a:blip r:embed="rId11"/>
+                    <a:stretch>
+                      <a:fillRect/>
+                    </a:stretch>
+                  </pic:blipFill>
+                  <pic:spPr>
+                    <a:xfrm>
+                      <a:off x="0" y="0"/>
+                      <a:ext cx="5943600" cy="2421890"/>
                     </a:xfrm>
                     <a:prstGeom prst="rect">
                       <a:avLst/>

</xml_diff>